<commit_message>
Quizz - Remove ParentPrivate
</commit_message>
<xml_diff>
--- a/docs/05_RankUp_Quiz_Business_QA.docx
+++ b/docs/05_RankUp_Quiz_Business_QA.docx
@@ -244,7 +244,7 @@
                 <w:sz w:val="17"/>
                 <w:szCs w:val="17"/>
               </w:rPr>
-              <w:t xml:space="preserve">PortalAdmin publish step only. Set when lifecycle moves Draft → Published after approval gates are satisfied. Shared catalog: Teacher, Coordinator, SchoolAdmin, CampusAdmin, PortalAdmin, and Parent may list and open the quiz regardless of creator or school (ParentPrivate excepted). Those roles may also assign it to their own students/children. Students receive it via assignment or AudienceScope=Public only — publish does not auto-enroll every student.</w:t>
+              <w:t xml:space="preserve">PortalAdmin publish step only. Set when lifecycle moves Draft → Published after approval gates are satisfied. Shared catalog: Teacher, Coordinator, SchoolAdmin, CampusAdmin, PortalAdmin, and Parent may list and open the quiz regardless of creator or school. Those roles may also assign it to their own students/children. Students receive it via assignment or AudienceScope=Public only — publish does not auto-enroll every student.</w:t>
             </w:r>
           </w:p>
         </w:tc>
@@ -539,7 +539,7 @@
                 <w:sz w:val="17"/>
                 <w:szCs w:val="17"/>
               </w:rPr>
-              <w:t xml:space="preserve">PortalAdmin final approval. Teacher/Coordinator/CampusAdmin: from Pending or SchoolApproved. SchoolAdmin/Parent created: from Pending directly. Does not by itself publish — lifecycle stays Draft until PortalAdmin runs publish. Owner cannot edit in place; they send an edit request. ParentPrivate: portal approve + publish may occur together via publish endpoint.</w:t>
+              <w:t xml:space="preserve">PortalAdmin final approval. Teacher/Coordinator/CampusAdmin: from Pending or SchoolApproved. SchoolAdmin/Parent created: from Pending directly. Does not by itself publish — lifecycle stays Draft until PortalAdmin runs publish. Owner cannot edit in place; they send an edit request. school-type: portal approve + publish may occur together via publish endpoint.</w:t>
             </w:r>
           </w:p>
         </w:tc>
@@ -960,7 +960,7 @@
           <w:sz w:val="21"/>
           <w:szCs w:val="21"/>
         </w:rPr>
-        <w:t xml:space="preserve">CampusAdmin created quiz: own SchoolAdmin may school-approve (Pending → SchoolApproved). Other CampusAdmins cannot endorse it. PortalAdmin then approves (→ Approved) and publishes. SchoolAdmin-created quizzes stay PortalAdmin only (Pending → Approved), same as Parent ParentPrivate.</w:t>
+        <w:t xml:space="preserve">CampusAdmin created quiz: own SchoolAdmin may school-approve (Pending → SchoolApproved). Other CampusAdmins cannot endorse it. PortalAdmin then approves (→ Approved) and publishes. SchoolAdmin-created quizzes stay PortalAdmin only (Pending → Approved), same as Parent school-type.</w:t>
       </w:r>
     </w:p>
     <w:p>
@@ -1062,24 +1062,24 @@
           <w:sz w:val="21"/>
           <w:szCs w:val="21"/>
         </w:rPr>
-        <w:t xml:space="preserve">Other authorized creators: CampusAdmin creates school quiz types and submits to SchoolAdmin (Pending → SchoolApproved), then PortalAdmin. SchoolAdmin creates school quiz types and submits to PortalAdmin only (Pending → Approved, then PortalAdmin publishes). ParentPrivate (PrivateParent): Parent create; PortalAdmin approve + publish before assign.</w:t>
-      </w:r>
-    </w:p>
-    <w:p>
-      <w:pPr>
-        <w:pStyle w:val="ListParagraph"/>
-        <w:numPr>
-          <w:ilvl w:val="0"/>
-          <w:numId w:val="1"/>
-        </w:numPr>
-        <w:spacing w:after="60"/>
-      </w:pPr>
-      <w:r>
-        <w:rPr>
-          <w:sz w:val="21"/>
-          <w:szCs w:val="21"/>
-        </w:rPr>
-        <w:t xml:space="preserve">Preserve published catalog visibility: Published school-type quizzes are a shared catalog for Teacher, Coordinator, SchoolAdmin, CampusAdmin, PortalAdmin, and Parent (any school, any creator) — not CreatedBy or school scope (see §6a). ParentPrivate and students are excluded from that catalog.</w:t>
+        <w:t xml:space="preserve">Other authorized creators: CampusAdmin creates school quiz types and submits to SchoolAdmin (Pending → SchoolApproved), then PortalAdmin. SchoolAdmin creates school quiz types and submits to PortalAdmin only (Pending → Approved, then PortalAdmin publishes). school-type: Parent create; PortalAdmin approve + publish before assign.</w:t>
+      </w:r>
+    </w:p>
+    <w:p>
+      <w:pPr>
+        <w:pStyle w:val="ListParagraph"/>
+        <w:numPr>
+          <w:ilvl w:val="0"/>
+          <w:numId w:val="1"/>
+        </w:numPr>
+        <w:spacing w:after="60"/>
+      </w:pPr>
+      <w:r>
+        <w:rPr>
+          <w:sz w:val="21"/>
+          <w:szCs w:val="21"/>
+        </w:rPr>
+        <w:t xml:space="preserve">Preserve published catalog visibility: Published school-type quizzes are a shared catalog for Teacher, Coordinator, SchoolAdmin, CampusAdmin, PortalAdmin, and Parent (any school, any creator) — not CreatedBy or school scope (see §6a). Students are excluded from that catalog.</w:t>
       </w:r>
     </w:p>
     <w:p>
@@ -2033,7 +2033,7 @@
                 <w:sz w:val="17"/>
                 <w:szCs w:val="17"/>
               </w:rPr>
-              <w:t xml:space="preserve">Teacher / Coordinator / SchoolAdmin / CampusAdmin / PortalAdmin</w:t>
+              <w:t xml:space="preserve">Teacher / Coordinator / SchoolAdmin / CampusAdmin / PortalAdmin / Parent</w:t>
             </w:r>
           </w:p>
         </w:tc>
@@ -2087,7 +2087,7 @@
                 <w:sz w:val="17"/>
                 <w:szCs w:val="17"/>
               </w:rPr>
-              <w:t xml:space="preserve">Teacher / Coordinator / SchoolAdmin / CampusAdmin / PortalAdmin</w:t>
+              <w:t xml:space="preserve">Teacher / Coordinator / SchoolAdmin / CampusAdmin / PortalAdmin / Parent</w:t>
             </w:r>
           </w:p>
         </w:tc>
@@ -2141,7 +2141,7 @@
                 <w:sz w:val="17"/>
                 <w:szCs w:val="17"/>
               </w:rPr>
-              <w:t xml:space="preserve">Teacher / Coordinator / SchoolAdmin / CampusAdmin / PortalAdmin</w:t>
+              <w:t xml:space="preserve">Teacher / Coordinator / SchoolAdmin / CampusAdmin / PortalAdmin / Parent</w:t>
             </w:r>
           </w:p>
         </w:tc>
@@ -2195,7 +2195,7 @@
                 <w:sz w:val="17"/>
                 <w:szCs w:val="17"/>
               </w:rPr>
-              <w:t xml:space="preserve">Teacher / Coordinator / SchoolAdmin / CampusAdmin / PortalAdmin</w:t>
+              <w:t xml:space="preserve">Teacher / Coordinator / SchoolAdmin / CampusAdmin / PortalAdmin / Parent</w:t>
             </w:r>
           </w:p>
         </w:tc>
@@ -2209,60 +2209,6 @@
                 <w:szCs w:val="17"/>
               </w:rPr>
               <w:t xml:space="preserve">Hidden from students until StartDateTime (no advance notice); availability window ≤24h; StartAt ≤ now+24h; ≤1 attempt. Assign notifications deferred until the window opens. Admin approval before assign. Broader PortalAdmin/AI-only authorship is future policy.</w:t>
-            </w:r>
-          </w:p>
-        </w:tc>
-      </w:tr>
-      <w:tr>
-        <w:tc>
-          <w:p>
-            <w:r>
-              <w:rPr>
-                <w:b w:val="false"/>
-                <w:bCs w:val="false"/>
-                <w:sz w:val="17"/>
-                <w:szCs w:val="17"/>
-              </w:rPr>
-              <w:t xml:space="preserve">5</w:t>
-            </w:r>
-          </w:p>
-        </w:tc>
-        <w:tc>
-          <w:p>
-            <w:r>
-              <w:rPr>
-                <w:b w:val="false"/>
-                <w:bCs w:val="false"/>
-                <w:sz w:val="17"/>
-                <w:szCs w:val="17"/>
-              </w:rPr>
-              <w:t xml:space="preserve">ParentPrivate (PrivateParent)</w:t>
-            </w:r>
-          </w:p>
-        </w:tc>
-        <w:tc>
-          <w:p>
-            <w:r>
-              <w:rPr>
-                <w:b w:val="false"/>
-                <w:bCs w:val="false"/>
-                <w:sz w:val="17"/>
-                <w:szCs w:val="17"/>
-              </w:rPr>
-              <w:t xml:space="preserve">Parent</w:t>
-            </w:r>
-          </w:p>
-        </w:tc>
-        <w:tc>
-          <w:p>
-            <w:r>
-              <w:rPr>
-                <w:b w:val="false"/>
-                <w:bCs w:val="false"/>
-                <w:sz w:val="17"/>
-                <w:szCs w:val="17"/>
-              </w:rPr>
-              <w:t xml:space="preserve">Private family quiz for linked children. Lookup ID 5; aliases Parent Private / Private. Create forces this type for Parent. Submit → Pending; PortalAdmin approves and publishes before assign. PortalAdmin-only delete/archive. Assign only to linked children.</w:t>
             </w:r>
           </w:p>
         </w:tc>
@@ -2381,7 +2327,7 @@
                 <w:sz w:val="17"/>
                 <w:szCs w:val="17"/>
               </w:rPr>
-              <w:t xml:space="preserve">Approval always starts Pending. Lifecycle Draft. Parent create forces QuizType ParentPrivate (PrivateParent). Teacher/Coordinator/SchoolAdmin/CampusAdmin/PortalAdmin: school types. CampusAdmin stamps school+campus from the auth token. Not assignable.</w:t>
+              <w:t xml:space="preserve">Approval always starts Pending. Lifecycle Draft. Parent and school staff create school types (Practice, Assessment, Competition, Surprise). CampusAdmin stamps school+campus from the auth token. Not assignable.</w:t>
             </w:r>
           </w:p>
         </w:tc>
@@ -2627,7 +2573,7 @@
                 <w:sz w:val="17"/>
                 <w:szCs w:val="17"/>
               </w:rPr>
-              <w:t xml:space="preserve">Draft → Published. Teacher/Coordinator quiz: requires Approved or SchoolApproved while Draft. SchoolAdmin/CampusAdmin/Parent created (and ParentPrivate): portal may approve from Pending, or approve+publish in one publish action. Only then assignable.</w:t>
+              <w:t xml:space="preserve">Draft → Published. Teacher/Coordinator quiz: requires Approved or SchoolApproved while Draft. SchoolAdmin/CampusAdmin/Parent created (and school-type): portal may approve from Pending, or approve+publish in one publish action. Only then assignable.</w:t>
             </w:r>
           </w:p>
         </w:tc>
@@ -2709,7 +2655,7 @@
                 <w:sz w:val="17"/>
                 <w:szCs w:val="17"/>
               </w:rPr>
-              <w:t xml:space="preserve">In-scope only. Reason required. SchoolAdmin: Pending Teacher/Coordinator/CampusAdmin quizzes in school. CampusAdmin: Pending Teacher/Coordinator in campus. Portal: Pending (including SchoolAdmin-created), SchoolApproved, or ParentPrivate queue. Creator must resubmit.</w:t>
+              <w:t xml:space="preserve">In-scope only. Reason required. SchoolAdmin: Pending Teacher/Coordinator/CampusAdmin quizzes in school. CampusAdmin: Pending Teacher/Coordinator in campus. Portal: Pending (including SchoolAdmin-created), SchoolApproved, or school-type queue. Creator must resubmit.</w:t>
             </w:r>
           </w:p>
         </w:tc>
@@ -2750,7 +2696,7 @@
                 <w:sz w:val="17"/>
                 <w:szCs w:val="17"/>
               </w:rPr>
-              <w:t xml:space="preserve">Requires Lifecycle Published or Assigned; not Draft. Teacher quizzes: Approval=Approved. ParentPrivate: Published + Approved; assign to linked children. ≥1 question.</w:t>
+              <w:t xml:space="preserve">Requires Lifecycle Published or Assigned; not Draft. Teacher quizzes: Approval=Approved. school-type: Published + Approved; assign to linked children. ≥1 question.</w:t>
             </w:r>
           </w:p>
         </w:tc>
@@ -2832,7 +2778,7 @@
                 <w:sz w:val="17"/>
                 <w:szCs w:val="17"/>
               </w:rPr>
-              <w:t xml:space="preserve">Published or Assigned (including assigned to students/children): PortalAdmin only. Other roles cannot archive after publish or after any assignment exists. Owners may hard-delete their own Draft (no assignments). ParentPrivate delete/archive → PortalAdmin only. No assignments → hard delete; else soft Archive.</w:t>
+              <w:t xml:space="preserve">Published or Assigned (including assigned to students/children): PortalAdmin only. Other roles cannot archive after publish or after any assignment exists. Owners may hard-delete their own Draft (no assignments). school-type delete/archive → PortalAdmin only. No assignments → hard delete; else soft Archive.</w:t>
             </w:r>
           </w:p>
         </w:tc>
@@ -3565,7 +3511,7 @@
                 <w:sz w:val="17"/>
                 <w:szCs w:val="17"/>
               </w:rPr>
-              <w:t xml:space="preserve">Own (ParentPrivate)</w:t>
+              <w:t xml:space="preserve">Own (school types)</w:t>
             </w:r>
           </w:p>
         </w:tc>
@@ -4519,7 +4465,7 @@
                 <w:sz w:val="17"/>
                 <w:szCs w:val="17"/>
               </w:rPr>
-              <w:t xml:space="preserve">No (ParentPrivate: Portal only)</w:t>
+              <w:t xml:space="preserve">Delete own Draft only — cannot archive Published/Assigned</w:t>
             </w:r>
           </w:p>
         </w:tc>
@@ -4625,7 +4571,7 @@
                 <w:sz w:val="17"/>
                 <w:szCs w:val="17"/>
               </w:rPr>
-              <w:t xml:space="preserve">Shared catalog → linked children/students; ParentPrivate own only</w:t>
+              <w:t xml:space="preserve">Shared catalog → linked children</w:t>
             </w:r>
           </w:p>
         </w:tc>
@@ -4653,7 +4599,7 @@
                 <w:sz w:val="17"/>
                 <w:szCs w:val="17"/>
               </w:rPr>
-              <w:t xml:space="preserve">Approve / reject ParentPrivate (PrivateParent) quizzes</w:t>
+              <w:t xml:space="preserve">Approve / reject Parent-created quizzes</w:t>
             </w:r>
           </w:p>
         </w:tc>
@@ -4772,7 +4718,7 @@
                 <w:sz w:val="17"/>
                 <w:szCs w:val="17"/>
               </w:rPr>
-              <w:t xml:space="preserve">Yes (Teacher/Coordinator/CampusAdmin Pending + SchoolApproved + SchoolAdmin/ParentPrivate Pending)</w:t>
+              <w:t xml:space="preserve">Yes (Teacher/Coordinator/CampusAdmin Pending + SchoolApproved + SchoolAdmin/school-type Pending)</w:t>
             </w:r>
           </w:p>
         </w:tc>
@@ -5049,7 +4995,7 @@
                 <w:sz w:val="17"/>
                 <w:szCs w:val="17"/>
               </w:rPr>
-              <w:t xml:space="preserve">All school-type (any school/creator) + linked assignments + own ParentPrivate</w:t>
+              <w:t xml:space="preserve">All school-type (any school/creator) + linked assignments + own school-type</w:t>
             </w:r>
           </w:p>
         </w:tc>
@@ -5477,7 +5423,7 @@
           <w:sz w:val="21"/>
           <w:szCs w:val="21"/>
         </w:rPr>
-        <w:t xml:space="preserve">Create: Practice, Assessment, Competition, Surprise (school quiz types). Starts Draft + Pending Approval. Cannot create ParentPrivate (PrivateParent) — Parent only.</w:t>
+        <w:t xml:space="preserve">Create: Practice, Assessment, Competition, Surprise (school quiz types). Starts Draft + Pending Approval. Parent creates the same school types.</w:t>
       </w:r>
     </w:p>
     <w:p>
@@ -5680,7 +5626,7 @@
           <w:sz w:val="21"/>
           <w:szCs w:val="21"/>
         </w:rPr>
-        <w:t xml:space="preserve">ParentPrivate (PrivateParent) is not in that shared catalog — owner, linked children/students, and PortalAdmin only.</w:t>
+        <w:t xml:space="preserve">Parent-created published school-type quizzes are in the same shared catalog as teacher-created quizzes.</w:t>
       </w:r>
     </w:p>
     <w:p>
@@ -5714,7 +5660,7 @@
           <w:sz w:val="21"/>
           <w:szCs w:val="21"/>
         </w:rPr>
-        <w:t xml:space="preserve">PortalAdmin → all published/assigned/archived quizzes, including ParentPrivate. Drafts: own WIP, plus other authors only after Submit for approval (Pending submitted, SchoolApproved, Approved, Rejected).</w:t>
+        <w:t xml:space="preserve">PortalAdmin → all published/assigned/archived quizzes, including school-type. Drafts: own WIP, plus other authors only after Submit for approval (Pending submitted, SchoolApproved, Approved, Rejected).</w:t>
       </w:r>
     </w:p>
     <w:p>
@@ -6915,7 +6861,7 @@
           <w:sz w:val="21"/>
           <w:szCs w:val="21"/>
         </w:rPr>
-        <w:t xml:space="preserve">A quiz may be assigned to: One student, Group, Parent linked child or student, Class, Section, School, Multiple schools, or Public. ParentPrivate (PrivateParent): Parent creators; assign to linked children only.</w:t>
+        <w:t xml:space="preserve">A quiz may be assigned to: One student, Group, Parent linked child or student, Class, Section, School, Multiple schools, or Public. school-type: Parent creators; assign to linked children only.</w:t>
       </w:r>
     </w:p>
     <w:tbl>
@@ -7150,7 +7096,7 @@
                 <w:sz w:val="17"/>
                 <w:szCs w:val="17"/>
               </w:rPr>
-              <w:t xml:space="preserve">Parent: one linked child, selected linked children, all linked children, or a parent-owned child group. ParentPrivate (PrivateParent) quizzes cannot target unrelated students, whole school, multi-school, or public. API modes: one / selected / allLinked / group.</w:t>
+              <w:t xml:space="preserve">Parent: one linked child, selected linked children, all linked children, or a parent-owned child group. school-type quizzes cannot target unrelated students, whole school, multi-school, or public. API modes: one / selected / allLinked / group.</w:t>
             </w:r>
           </w:p>
         </w:tc>
@@ -7474,7 +7420,7 @@
           <w:sz w:val="21"/>
           <w:szCs w:val="21"/>
         </w:rPr>
-        <w:t xml:space="preserve">ParentPrivate (PrivateParent) quizzes may only target the creator’s linked children — never unrelated students, whole school, multi-school, or public.</w:t>
+        <w:t xml:space="preserve">school-type quizzes may only target the creator’s linked children — never unrelated students, whole school, multi-school, or public.</w:t>
       </w:r>
     </w:p>
     <w:p>
@@ -12421,24 +12367,24 @@
           <w:sz w:val="21"/>
           <w:szCs w:val="21"/>
         </w:rPr>
-        <w:t xml:space="preserve">Parent list = shared published school-type catalog ∪ linked-child assignments ∪ own ParentPrivate.</w:t>
-      </w:r>
-    </w:p>
-    <w:p>
-      <w:pPr>
-        <w:pStyle w:val="ListParagraph"/>
-        <w:numPr>
-          <w:ilvl w:val="0"/>
-          <w:numId w:val="1"/>
-        </w:numPr>
-        <w:spacing w:after="60"/>
-      </w:pPr>
-      <w:r>
-        <w:rPr>
-          <w:sz w:val="21"/>
-          <w:szCs w:val="21"/>
-        </w:rPr>
-        <w:t xml:space="preserve">Parent list = shared published school-type catalog ∪ linked-child assignments ∪ own ParentPrivate.</w:t>
+        <w:t xml:space="preserve">Parent list = shared published school-type catalog ∪ linked-child assignments ∪ own school-type.</w:t>
+      </w:r>
+    </w:p>
+    <w:p>
+      <w:pPr>
+        <w:pStyle w:val="ListParagraph"/>
+        <w:numPr>
+          <w:ilvl w:val="0"/>
+          <w:numId w:val="1"/>
+        </w:numPr>
+        <w:spacing w:after="60"/>
+      </w:pPr>
+      <w:r>
+        <w:rPr>
+          <w:sz w:val="21"/>
+          <w:szCs w:val="21"/>
+        </w:rPr>
+        <w:t xml:space="preserve">Parent list = shared published school-type catalog ∪ linked-child assignments ∪ own school-type.</w:t>
       </w:r>
     </w:p>
     <w:p>
@@ -12679,7 +12625,7 @@
                 <w:sz w:val="17"/>
                 <w:szCs w:val="17"/>
               </w:rPr>
-              <w:t xml:space="preserve">Role-scoped list. Student: assigned ∪ Public audience. Teacher/Coordinator/SchoolAdmin/CampusAdmin/Parent: all Published/Assigned/Archived school-type quizzes (any school, any creator) ∪ own drafts. SchoolAdmin also includes Teacher/Coordinator/CampusAdmin submitted pipeline drafts in the same school; CampusAdmin includes Teacher/Coordinator submitted drafts in the same campus. Parent also merge quizzes assigned to linked children/students. PortalAdmin: all published/assigned/archived plus pipeline drafts. ParentPrivate is not in the shared catalog (owner + PortalAdmin). Unsubmitted WIP drafts: owner only.</w:t>
+              <w:t xml:space="preserve">Role-scoped list. Student: assigned ∪ Public audience. Teacher/Coordinator/SchoolAdmin/CampusAdmin/Parent: all Published/Assigned/Archived school-type quizzes (any school, any creator) ∪ own drafts. SchoolAdmin also includes Teacher/Coordinator/CampusAdmin submitted pipeline drafts in the same school; CampusAdmin includes Teacher/Coordinator submitted drafts in the same campus. Parent also merge quizzes assigned to linked children/students. PortalAdmin: all published/assigned/archived plus pipeline drafts. Unsubmitted WIP drafts: owner only.</w:t>
             </w:r>
           </w:p>
         </w:tc>
@@ -12707,7 +12653,7 @@
                 <w:sz w:val="17"/>
                 <w:szCs w:val="17"/>
               </w:rPr>
-              <w:t xml:space="preserve">Create Draft + Pending. Parent: QuizType forced to ParentPrivate (PrivateParent). Teacher/Coordinator/SchoolAdmin/CampusAdmin/PortalAdmin: school types. CampusAdmin school+campus from auth token. SchoolAdmin school from token (campus optional). PortalAdmin school/campus optional.</w:t>
+              <w:t xml:space="preserve">Create Draft + Pending. Parent and school staff: school types (Practice, Assessment, Competition, Surprise). CampusAdmin school+campus from auth token. SchoolAdmin school from token (campus optional). PortalAdmin school/campus optional.</w:t>
             </w:r>
           </w:p>
         </w:tc>
@@ -12791,7 +12737,7 @@
                 <w:sz w:val="17"/>
                 <w:szCs w:val="17"/>
               </w:rPr>
-              <w:t xml:space="preserve">Manage view with questions. Published/Assigned/Archived school-type quizzes: any Teacher/Coordinator/SchoolAdmin/CampusAdmin/PortalAdmin/Parent. Draft: owner always. After Submit for approval: PortalAdmin any pipeline draft; SchoolAdmin Teacher/Coordinator/CampusAdmin pipeline drafts in the same school; CampusAdmin Teacher/Coordinator pipeline drafts in the same campus. ParentPrivate drafts: owner + PortalAdmin. Unsubmitted WIP hidden from non-owner.</w:t>
+              <w:t xml:space="preserve">Manage view with questions. Published/Assigned/Archived school-type quizzes: any Teacher/Coordinator/SchoolAdmin/CampusAdmin/PortalAdmin/Parent. Draft: owner always. After Submit for approval: PortalAdmin any pipeline draft; SchoolAdmin Teacher/Coordinator/CampusAdmin pipeline drafts in the same school; CampusAdmin Teacher/Coordinator pipeline drafts in the same campus. school-type drafts: owner + PortalAdmin. Unsubmitted WIP hidden from non-owner.</w:t>
             </w:r>
           </w:p>
         </w:tc>
@@ -12819,7 +12765,7 @@
                 <w:sz w:val="17"/>
                 <w:szCs w:val="17"/>
               </w:rPr>
-              <w:t xml:space="preserve">Non–PortalAdmin: submit for approval (Draft+Pending). Teacher/Coordinator notify school+campus+portal; CampusAdmin notify SchoolAdmin + PortalAdmin; SchoolAdmin/Parent notify PortalAdmin only. PortalAdmin: publish (Draft→Published) when approval gates met; may set Approved in same flow for ParentPrivate and for SchoolAdmin-created quizzes still Pending.</w:t>
+              <w:t xml:space="preserve">Non–PortalAdmin: submit for approval (Draft+Pending). Teacher/Coordinator notify school+campus+portal; CampusAdmin notify SchoolAdmin + PortalAdmin; SchoolAdmin/Parent notify PortalAdmin only. PortalAdmin: publish (Draft→Published) when approval gates met; may set Approved in same flow for school-type and for SchoolAdmin-created quizzes still Pending.</w:t>
             </w:r>
           </w:p>
         </w:tc>
@@ -13323,7 +13269,7 @@
                 <w:sz w:val="17"/>
                 <w:szCs w:val="17"/>
               </w:rPr>
-              <w:t xml:space="preserve">API queue still exists for clients. Web UI does not use a separate approvals page — SchoolAdmin/CampusAdmin/PortalAdmin open submitted drafts from the /quizzes Draft tile. Pending rows require Submit for approval. SchoolAdmin queue: Teacher/Coordinator/CampusAdmin created. CampusAdmin queue: Teacher/Coordinator created only. PortalAdmin also includes SchoolApproved and SchoolAdmin/ParentPrivate Pending.</w:t>
+              <w:t xml:space="preserve">API queue still exists for clients. Web UI does not use a separate approvals page — SchoolAdmin/CampusAdmin/PortalAdmin open submitted drafts from the /quizzes Draft tile. Pending rows require Submit for approval. SchoolAdmin queue: Teacher/Coordinator/CampusAdmin created. CampusAdmin queue: Teacher/Coordinator created only. PortalAdmin also includes SchoolApproved and SchoolAdmin/school-type Pending.</w:t>
             </w:r>
           </w:p>
         </w:tc>
@@ -13763,7 +13709,7 @@
           <w:sz w:val="24"/>
           <w:szCs w:val="24"/>
         </w:rPr>
-        <w:t xml:space="preserve">QZ-03 — Parent ParentPrivate → portal approve and publish</w:t>
+        <w:t xml:space="preserve">QZ-03 — Parent school-type → portal approve and publish</w:t>
       </w:r>
     </w:p>
     <w:p>
@@ -13775,7 +13721,7 @@
           <w:sz w:val="21"/>
           <w:szCs w:val="21"/>
         </w:rPr>
-        <w:t xml:space="preserve">Steps: Parent creates and submits a ParentPrivate (PrivateParent) quiz; PortalAdmin approves and publishes before assign.</w:t>
+        <w:t xml:space="preserve">Steps: Parent creates and submits a school-type quiz; PortalAdmin approves and publishes before assign.</w:t>
       </w:r>
     </w:p>
     <w:p>
@@ -14675,7 +14621,7 @@
           <w:sz w:val="24"/>
           <w:szCs w:val="24"/>
         </w:rPr>
-        <w:t xml:space="preserve">QZ-17 — ParentPrivate assign scope (Parent)</w:t>
+        <w:t xml:space="preserve">QZ-17 — school-type assign scope (Parent)</w:t>
       </w:r>
     </w:p>
     <w:p>
@@ -14687,7 +14633,7 @@
           <w:sz w:val="21"/>
           <w:szCs w:val="21"/>
         </w:rPr>
-        <w:t xml:space="preserve">Steps: Parent tries to assign ParentPrivate quiz to an unrelated student or whole school.</w:t>
+        <w:t xml:space="preserve">Steps: Parent tries to assign school-type quiz to an unrelated student or whole school.</w:t>
       </w:r>
     </w:p>
     <w:p>
@@ -14899,7 +14845,7 @@
           <w:sz w:val="21"/>
           <w:szCs w:val="21"/>
         </w:rPr>
-        <w:t xml:space="preserve">Expected: Teacher, Coordinator, Parent, PortalAdmin, AES SchoolAdmin, and ISL SchoolAdmin each see published A, B, and C (9 in the reported case: 7 AES + 2 Portal). Creator and school do not hide published school-type quizzes. Those roles may assign a catalog quiz to their own students/children. ParentPrivate stays private. Students still only see assigned ∪ AudienceScope=Public. Unsubmitted Draft remains owner-only.</w:t>
+        <w:t xml:space="preserve">Expected: Teacher, Coordinator, Parent, PortalAdmin, AES SchoolAdmin, and ISL SchoolAdmin each see published A, B, and C (9 in the reported case: 7 AES + 2 Portal). Creator and school do not hide published school-type quizzes. Those roles may assign a catalog quiz to their own students/children. Students still only see assigned ∪ AudienceScope=Public. Unsubmitted Draft remains owner-only.</w:t>
       </w:r>
     </w:p>
     <w:p>
@@ -15184,7 +15130,7 @@
           <w:sz w:val="21"/>
           <w:szCs w:val="21"/>
         </w:rPr>
-        <w:t xml:space="preserve">☐ ParentPrivate (PrivateParent): Parent may create; PortalAdmin approve + publish before assign.</w:t>
+        <w:t xml:space="preserve">☐ school-type: Parent may create; PortalAdmin approve + publish before assign.</w:t>
       </w:r>
     </w:p>
     <w:p>
@@ -15218,7 +15164,7 @@
           <w:sz w:val="21"/>
           <w:szCs w:val="21"/>
         </w:rPr>
-        <w:t xml:space="preserve">☐ Published school-type quizzes: shared catalog — Teacher, Coordinator, SchoolAdmin, CampusAdmin, PortalAdmin, and Parent can list and open them, regardless of creator or school. ParentPrivate excluded. Students still need assignment or AudienceScope=Public.</w:t>
+        <w:t xml:space="preserve">☐ Published school-type quizzes: shared catalog — Teacher, Coordinator, SchoolAdmin, CampusAdmin, PortalAdmin, and Parent can list and open them, regardless of creator or school. Students still need assignment or AudienceScope=Public.</w:t>
       </w:r>
     </w:p>
     <w:p>
@@ -15303,7 +15249,7 @@
           <w:sz w:val="21"/>
           <w:szCs w:val="21"/>
         </w:rPr>
-        <w:t xml:space="preserve">☐ Teacher/Coordinator/Parent assign of a published school-type catalog quiz requires Lifecycle Published or Assigned and Approval=Approved. Parent ParentPrivate assign still requires Published + Approved and linked children/students only.</w:t>
+        <w:t xml:space="preserve">☐ Teacher/Coordinator/Parent assign of a published school-type catalog quiz requires Lifecycle Published or Assigned and Approval=Approved. Parent school-type assign still requires Published + Approved and linked children/students only.</w:t>
       </w:r>
     </w:p>
     <w:p>

</xml_diff>